<commit_message>
Review fixes: answer keys, Windrush order, Heroes pack
</commit_message>
<xml_diff>
--- a/08_The_Windrush_Generation_Facilitator_Guide.docx
+++ b/08_The_Windrush_Generation_Facilitator_Guide.docx
@@ -1789,7 +1789,7 @@
                 <w:color w:val="1A1A1A"/>
                 <w:sz w:val="20"/>
               </w:rPr>
-              <w:t>3</w:t>
+              <w:t xml:space="preserve">2</w:t>
             </w:r>
           </w:p>
         </w:tc>
@@ -1862,7 +1862,7 @@
                 <w:color w:val="1A1A1A"/>
                 <w:sz w:val="20"/>
               </w:rPr>
-              <w:t>5</w:t>
+              <w:t xml:space="preserve">5</w:t>
             </w:r>
           </w:p>
         </w:tc>
@@ -1933,7 +1933,7 @@
                 <w:color w:val="1A1A1A"/>
                 <w:sz w:val="20"/>
               </w:rPr>
-              <w:t>1</w:t>
+              <w:t xml:space="preserve">1</w:t>
             </w:r>
           </w:p>
         </w:tc>
@@ -2006,7 +2006,7 @@
                 <w:color w:val="1A1A1A"/>
                 <w:sz w:val="20"/>
               </w:rPr>
-              <w:t>4</w:t>
+              <w:t xml:space="preserve">3</w:t>
             </w:r>
           </w:p>
         </w:tc>
@@ -2043,7 +2043,7 @@
                 <w:color w:val="1A1A1A"/>
                 <w:sz w:val="20"/>
               </w:rPr>
-              <w:t>Box 5: The British Nationality Act 1948 is passed</w:t>
+              <w:t xml:space="preserve">Box 5: The British Nationality Act becomes law (30 July 1948)</w:t>
             </w:r>
           </w:p>
         </w:tc>
@@ -2075,7 +2075,7 @@
                 <w:color w:val="1A1A1A"/>
                 <w:sz w:val="20"/>
               </w:rPr>
-              <w:t>2</w:t>
+              <w:t xml:space="preserve">4</w:t>
             </w:r>
           </w:p>
         </w:tc>
@@ -2325,7 +2325,7 @@
                 <w:color w:val="1A1A1A"/>
                 <w:sz w:val="20"/>
               </w:rPr>
-              <w:t>The 1948 Act made them British citizens.</w:t>
+              <w:t xml:space="preserve">As British subjects they had this right, and the 1948 Act confirmed it.</w:t>
             </w:r>
           </w:p>
         </w:tc>

</xml_diff>